<commit_message>
Set Myriad Pro 20px font in documents.mermaid; fix font-size floor
examples/documents.mermaid:
- Add themeVariables to %%{init}%% block: fontFamily 'Myriad Pro',
  fontSize '20px'

R/drawingml.R:
- Change font_size_hp formula to take max(proportional, css_floor, 16L)
  where css_floor = round(font_size_px * 1.5) converts CSS px to half-
  points (px × 72/96 × 2). The proportional-only formula produced 5pt
  for complex wide diagrams (the larger SVG font increases node size,
  widening the diagram, reducing scale, cancelling the size increase).
  The CSS floor ensures the Word font is never smaller than the
  physically-equivalent pt size of the mermaid fontSize setting.
  Simple diagrams are unaffected (proportional ≥ css_floor for them).
  Result: documents.mermaid now renders at 15pt Myriad Pro in Word.

Co-Authored-By: Claude Sonnet 4.6 <noreply@anthropic.com>
</commit_message>
<xml_diff>
--- a/dev/waste-CSM-styled.docx
+++ b/dev/waste-CSM-styled.docx
@@ -76,8 +76,8 @@
                                   <w:rPr>
                                     <w:rFonts w:ascii="Myriad Pro" w:hAnsi="Myriad Pro" w:cs="Myriad Pro"/>
                                     <w:color w:val="700017"/>
-                                    <w:sz w:val="8"/>
-                                    <w:szCs w:val="8"/>
+                                    <w:sz w:val="30"/>
+                                    <w:szCs w:val="30"/>
                                   </w:rPr>
                                   <w:t xml:space="preserve">Landfill</w:t>
                                 </w:r>
@@ -120,8 +120,8 @@
                                   <w:rPr>
                                     <w:rFonts w:ascii="Myriad Pro" w:hAnsi="Myriad Pro" w:cs="Myriad Pro"/>
                                     <w:color w:val="700017"/>
-                                    <w:sz w:val="8"/>
-                                    <w:szCs w:val="8"/>
+                                    <w:sz w:val="30"/>
+                                    <w:szCs w:val="30"/>
                                   </w:rPr>
                                   <w:t xml:space="preserve">Active Cell</w:t>
                                 </w:r>
@@ -164,8 +164,8 @@
                                   <w:rPr>
                                     <w:rFonts w:ascii="Myriad Pro" w:hAnsi="Myriad Pro" w:cs="Myriad Pro"/>
                                     <w:color w:val="700017"/>
-                                    <w:sz w:val="8"/>
-                                    <w:szCs w:val="8"/>
+                                    <w:sz w:val="30"/>
+                                    <w:szCs w:val="30"/>
                                   </w:rPr>
                                   <w:t xml:space="preserve">Cover</w:t>
                                 </w:r>
@@ -204,8 +204,8 @@
                                   <w:rPr>
                                     <w:rFonts w:ascii="Myriad Pro" w:hAnsi="Myriad Pro" w:cs="Myriad Pro"/>
                                     <w:color w:val="000000"/>
-                                    <w:sz w:val="8"/>
-                                    <w:szCs w:val="8"/>
+                                    <w:sz w:val="30"/>
+                                    <w:szCs w:val="30"/>
                                   </w:rPr>
                                   <w:t xml:space="preserve">Compaction</w:t>
                                 </w:r>
@@ -368,8 +368,8 @@
                                   <w:rPr>
                                     <w:rFonts w:ascii="Myriad Pro" w:hAnsi="Myriad Pro" w:cs="Myriad Pro"/>
                                     <w:color w:val="006A5C"/>
-                                    <w:sz w:val="8"/>
-                                    <w:szCs w:val="8"/>
+                                    <w:sz w:val="30"/>
+                                    <w:szCs w:val="30"/>
                                   </w:rPr>
                                   <w:t xml:space="preserve">Municipal</w:t>
                                 </w:r>
@@ -412,8 +412,8 @@
                                   <w:rPr>
                                     <w:rFonts w:ascii="Myriad Pro" w:hAnsi="Myriad Pro" w:cs="Myriad Pro"/>
                                     <w:color w:val="006A5C"/>
-                                    <w:sz w:val="8"/>
-                                    <w:szCs w:val="8"/>
+                                    <w:sz w:val="30"/>
+                                    <w:szCs w:val="30"/>
                                   </w:rPr>
                                   <w:t xml:space="preserve">Resident sorting</w:t>
                                 </w:r>
@@ -456,8 +456,8 @@
                                   <w:rPr>
                                     <w:rFonts w:ascii="Myriad Pro" w:hAnsi="Myriad Pro" w:cs="Myriad Pro"/>
                                     <w:color w:val="006A5C"/>
-                                    <w:sz w:val="8"/>
-                                    <w:szCs w:val="8"/>
+                                    <w:sz w:val="30"/>
+                                    <w:szCs w:val="30"/>
                                   </w:rPr>
                                   <w:t xml:space="preserve">Kerbside Collection</w:t>
                                 </w:r>
@@ -533,8 +533,8 @@
                                     <w:rPr>
                                       <w:rFonts w:ascii="Myriad Pro" w:hAnsi="Myriad Pro" w:cs="Myriad Pro"/>
                                       <w:color w:val="006A5C"/>
-                                      <w:sz w:val="8"/>
-                                      <w:szCs w:val="8"/>
+                                      <w:sz w:val="30"/>
+                                      <w:szCs w:val="30"/>
                                     </w:rPr>
                                     <w:t xml:space="preserve">Collection Screening</w:t>
                                   </w:r>
@@ -611,8 +611,8 @@
                                     <w:rPr>
                                       <w:rFonts w:ascii="Myriad Pro" w:hAnsi="Myriad Pro" w:cs="Myriad Pro"/>
                                       <w:color w:val="006A5C"/>
-                                      <w:sz w:val="8"/>
-                                      <w:szCs w:val="8"/>
+                                      <w:sz w:val="30"/>
+                                      <w:szCs w:val="30"/>
                                     </w:rPr>
                                     <w:t xml:space="preserve">Not collected</w:t>
                                   </w:r>
@@ -774,8 +774,8 @@
                                   <w:rPr>
                                     <w:rFonts w:ascii="Myriad Pro" w:hAnsi="Myriad Pro" w:cs="Myriad Pro"/>
                                     <w:color w:val="507811"/>
-                                    <w:sz w:val="8"/>
-                                    <w:szCs w:val="8"/>
+                                    <w:sz w:val="30"/>
+                                    <w:szCs w:val="30"/>
                                   </w:rPr>
                                   <w:t xml:space="preserve">Resource&amp;Recovery</w:t>
                                 </w:r>
@@ -818,8 +818,8 @@
                                   <w:rPr>
                                     <w:rFonts w:ascii="Myriad Pro" w:hAnsi="Myriad Pro" w:cs="Myriad Pro"/>
                                     <w:color w:val="507811"/>
-                                    <w:sz w:val="8"/>
-                                    <w:szCs w:val="8"/>
+                                    <w:sz w:val="30"/>
+                                    <w:szCs w:val="30"/>
                                   </w:rPr>
                                   <w:t xml:space="preserve">Stockpiles</w:t>
                                 </w:r>
@@ -895,8 +895,8 @@
                                     <w:rPr>
                                       <w:rFonts w:ascii="Myriad Pro" w:hAnsi="Myriad Pro" w:cs="Myriad Pro"/>
                                       <w:color w:val="507811"/>
-                                      <w:sz w:val="8"/>
-                                      <w:szCs w:val="8"/>
+                                      <w:sz w:val="30"/>
+                                      <w:szCs w:val="30"/>
                                     </w:rPr>
                                     <w:t xml:space="preserve">Tertiary Screening</w:t>
                                   </w:r>
@@ -973,8 +973,8 @@
                                     <w:rPr>
                                       <w:rFonts w:ascii="Myriad Pro" w:hAnsi="Myriad Pro" w:cs="Myriad Pro"/>
                                       <w:color w:val="507811"/>
-                                      <w:sz w:val="8"/>
-                                      <w:szCs w:val="8"/>
+                                      <w:sz w:val="30"/>
+                                      <w:szCs w:val="30"/>
                                     </w:rPr>
                                     <w:t xml:space="preserve">Transport Off Site</w:t>
                                   </w:r>
@@ -1100,8 +1100,8 @@
                                   <w:rPr>
                                     <w:rFonts w:ascii="Myriad Pro" w:hAnsi="Myriad Pro" w:cs="Myriad Pro"/>
                                     <w:color w:val="005490"/>
-                                    <w:sz w:val="8"/>
-                                    <w:szCs w:val="8"/>
+                                    <w:sz w:val="30"/>
+                                    <w:szCs w:val="30"/>
                                   </w:rPr>
                                   <w:t xml:space="preserve">Domestic/Commercial</w:t>
                                 </w:r>
@@ -1153,8 +1153,8 @@
                                     <w:rPr>
                                       <w:rFonts w:ascii="Myriad Pro" w:hAnsi="Myriad Pro" w:cs="Myriad Pro"/>
                                       <w:color w:val="5E504E"/>
-                                      <w:sz w:val="8"/>
-                                      <w:szCs w:val="8"/>
+                                      <w:sz w:val="30"/>
+                                      <w:szCs w:val="30"/>
                                     </w:rPr>
                                     <w:t xml:space="preserve">Small Vehicle Area</w:t>
                                   </w:r>
@@ -1230,8 +1230,8 @@
                                       <w:rPr>
                                         <w:rFonts w:ascii="Myriad Pro" w:hAnsi="Myriad Pro" w:cs="Myriad Pro"/>
                                         <w:color w:val="005490"/>
-                                        <w:sz w:val="8"/>
-                                        <w:szCs w:val="8"/>
+                                        <w:sz w:val="30"/>
+                                        <w:szCs w:val="30"/>
                                       </w:rPr>
                                       <w:t xml:space="preserve">Secondary Screening</w:t>
                                     </w:r>
@@ -1275,8 +1275,8 @@
                                     <w:rPr>
                                       <w:rFonts w:ascii="Myriad Pro" w:hAnsi="Myriad Pro" w:cs="Myriad Pro"/>
                                       <w:color w:val="005490"/>
-                                      <w:sz w:val="8"/>
-                                      <w:szCs w:val="8"/>
+                                      <w:sz w:val="30"/>
+                                      <w:szCs w:val="30"/>
                                     </w:rPr>
                                     <w:t xml:space="preserve">Reuse Shed</w:t>
                                   </w:r>
@@ -1319,8 +1319,8 @@
                                     <w:rPr>
                                       <w:rFonts w:ascii="Myriad Pro" w:hAnsi="Myriad Pro" w:cs="Myriad Pro"/>
                                       <w:color w:val="005490"/>
-                                      <w:sz w:val="8"/>
-                                      <w:szCs w:val="8"/>
+                                      <w:sz w:val="30"/>
+                                      <w:szCs w:val="30"/>
                                     </w:rPr>
                                     <w:t xml:space="preserve">Small Vehicle Area Bins</w:t>
                                   </w:r>
@@ -1483,8 +1483,8 @@
                                     <w:rPr>
                                       <w:rFonts w:ascii="Myriad Pro" w:hAnsi="Myriad Pro" w:cs="Myriad Pro"/>
                                       <w:color w:val="5E504E"/>
-                                      <w:sz w:val="8"/>
-                                      <w:szCs w:val="8"/>
+                                      <w:sz w:val="30"/>
+                                      <w:szCs w:val="30"/>
                                     </w:rPr>
                                     <w:t xml:space="preserve">Gatehouse</w:t>
                                   </w:r>
@@ -1560,8 +1560,8 @@
                                       <w:rPr>
                                         <w:rFonts w:ascii="Myriad Pro" w:hAnsi="Myriad Pro" w:cs="Myriad Pro"/>
                                         <w:color w:val="005490"/>
-                                        <w:sz w:val="8"/>
-                                        <w:szCs w:val="8"/>
+                                        <w:sz w:val="30"/>
+                                        <w:szCs w:val="30"/>
                                       </w:rPr>
                                       <w:t xml:space="preserve">Initial Screening</w:t>
                                     </w:r>
@@ -1639,8 +1639,8 @@
                                     <w:rPr>
                                       <w:rFonts w:ascii="Myriad Pro" w:hAnsi="Myriad Pro" w:cs="Myriad Pro"/>
                                       <w:color w:val="005490"/>
-                                      <w:sz w:val="8"/>
-                                      <w:szCs w:val="8"/>
+                                      <w:sz w:val="30"/>
+                                      <w:szCs w:val="30"/>
                                     </w:rPr>
                                     <w:t xml:space="preserve">Exit site</w:t>
                                   </w:r>

</xml_diff>